<commit_message>
Improve ATS optimization: TYPE A/B strategy, Skills dedup, blocked-site detection
- Rewrote tailor-resume system prompt with explicit TYPE A (Skills bulk add)
  and TYPE B (bullet term swap) strategies with good/bad examples to prevent
  incoherent mid-sentence keyword insertions
- Added extractSkillsSection() to pass current Skills content to the model
  so it never re-adds already-present keywords
- Increased word budget to 60 total / 15 per modification for better coverage
- Added isHeaderText() code guard to prevent LLM from modifying name/contact
- Added isFinishedSentence guard to reject clause-appending after periods/metrics
- Added detectBlockedSite() for Meta, LinkedIn, Glassdoor, Indeed
- Added detectListingPage() to reject search-result URLs
- Fixed URL-in-textarea detection: auto-switches to URL mode
- Added includeFiles for chromium in scrape-jd vercel.json entry
- Updated bundled resume file

Co-Authored-By: Claude Sonnet 4.6 <noreply@anthropic.com>
</commit_message>
<xml_diff>
--- a/public/resumes/Gnyani_Resume_Final.docx
+++ b/public/resumes/Gnyani_Resume_Final.docx
@@ -33,14 +33,16 @@
         <w:jc w:val="both"/>
         <w:rPr>
           <w:b/>
-          <w:sz w:val="20"/>
-        </w:rPr>
-      </w:pPr>
-      <w:r>
-        <w:rPr>
-          <w:b/>
-          <w:spacing w:val="-2"/>
-          <w:sz w:val="20"/>
+          <w:sz w:val="21"/>
+          <w:szCs w:val="24"/>
+        </w:rPr>
+      </w:pPr>
+      <w:r>
+        <w:rPr>
+          <w:b/>
+          <w:spacing w:val="-2"/>
+          <w:sz w:val="21"/>
+          <w:szCs w:val="24"/>
         </w:rPr>
         <w:t>Experience</w:t>
       </w:r>
@@ -78,7 +80,7 @@
       <w:pPr>
         <w:pStyle w:val="BodyText"/>
         <w:spacing w:before="67"/>
-        <w:ind w:left="575" w:hanging="185" w:right="2463"/>
+        <w:ind w:left="575" w:right="2463" w:hanging="185"/>
         <w:jc w:val="center"/>
       </w:pPr>
       <w:r>
@@ -503,7 +505,7 @@
           <w:tab w:val="left" w:pos="575"/>
         </w:tabs>
         <w:spacing w:before="48" w:line="230" w:lineRule="auto"/>
-        <w:ind w:left="575" w:hanging="185" w:right="361"/>
+        <w:ind w:right="361"/>
         <w:rPr>
           <w:rFonts w:ascii="Arial" w:hAnsi="Arial"/>
           <w:position w:val="2"/>
@@ -534,87 +536,78 @@
           <w:spacing w:val="16"/>
           <w:sz w:val="20"/>
         </w:rPr>
-        <w:t xml:space="preserve"> </w:t>
-      </w:r>
-      <w:r>
-        <w:rPr>
-          <w:b/>
-          <w:sz w:val="20"/>
-        </w:rPr>
-        <w:t>AI</w:t>
-      </w:r>
-      <w:r>
-        <w:rPr>
-          <w:b/>
+        <w:t>,</w:t>
+      </w:r>
+      <w:r>
+        <w:rPr>
+          <w:sz w:val="20"/>
+        </w:rPr>
+        <w:t>c</w:t>
+      </w:r>
+      <w:r>
+        <w:rPr>
           <w:spacing w:val="16"/>
           <w:sz w:val="20"/>
         </w:rPr>
-        <w:t xml:space="preserve"> </w:t>
-      </w:r>
-      <w:r>
-        <w:rPr>
-          <w:b/>
-          <w:sz w:val="20"/>
-        </w:rPr>
-        <w:t xml:space="preserve">automation </w:t>
-      </w:r>
-      <w:r>
-        <w:rPr>
-          <w:sz w:val="20"/>
-        </w:rPr>
-        <w:t>ecosystems</w:t>
+        <w:t>u</w:t>
+      </w:r>
+      <w:r>
+        <w:rPr>
+          <w:sz w:val="20"/>
+        </w:rPr>
+        <w:t>tting-edge distribute</w:t>
       </w:r>
       <w:r>
         <w:rPr>
           <w:spacing w:val="17"/>
           <w:sz w:val="20"/>
         </w:rPr>
-        <w:t xml:space="preserve"> </w:t>
-      </w:r>
-      <w:r>
-        <w:rPr>
-          <w:sz w:val="20"/>
-        </w:rPr>
-        <w:t>supporting</w:t>
+        <w:t>d</w:t>
+      </w:r>
+      <w:r>
+        <w:rPr>
+          <w:sz w:val="20"/>
+        </w:rPr>
+        <w:t>systems a</w:t>
       </w:r>
       <w:r>
         <w:rPr>
           <w:spacing w:val="16"/>
           <w:sz w:val="20"/>
         </w:rPr>
-        <w:t xml:space="preserve"> </w:t>
-      </w:r>
-      <w:r>
-        <w:rPr>
-          <w:sz w:val="20"/>
-        </w:rPr>
-        <w:t>multi-team operations,</w:t>
+        <w:t>n</w:t>
+      </w:r>
+      <w:r>
+        <w:rPr>
+          <w:sz w:val="20"/>
+        </w:rPr>
+        <w:t>d AI automation ecosys</w:t>
       </w:r>
       <w:r>
         <w:rPr>
           <w:spacing w:val="20"/>
           <w:sz w:val="20"/>
         </w:rPr>
-        <w:t xml:space="preserve"> </w:t>
-      </w:r>
-      <w:r>
-        <w:rPr>
-          <w:sz w:val="20"/>
-        </w:rPr>
-        <w:t>integrating</w:t>
+        <w:t>t</w:t>
+      </w:r>
+      <w:r>
+        <w:rPr>
+          <w:sz w:val="20"/>
+        </w:rPr>
+        <w:t>ems support</w:t>
       </w:r>
       <w:r>
         <w:rPr>
           <w:spacing w:val="16"/>
           <w:sz w:val="20"/>
         </w:rPr>
-        <w:t xml:space="preserve"> </w:t>
-      </w:r>
-      <w:r>
-        <w:rPr>
-          <w:sz w:val="20"/>
-        </w:rPr>
-        <w:t>predictive analytics, semantic search, and workflow orchestration to accelerate business-intelligence delivery.</w:t>
+        <w:t>i</w:t>
+      </w:r>
+      <w:r>
+        <w:rPr>
+          <w:sz w:val="20"/>
+        </w:rPr>
+        <w:t>ng multi-team operations, integrating predictive analytics, semantic search, and workflow orchestration to accelerate business-intelligence delivery.</w:t>
       </w:r>
     </w:p>
     <w:p>
@@ -628,7 +621,7 @@
           <w:tab w:val="left" w:pos="575"/>
         </w:tabs>
         <w:spacing w:before="2" w:line="230" w:lineRule="auto"/>
-        <w:ind w:left="575" w:hanging="185" w:right="354"/>
+        <w:ind w:right="354"/>
         <w:rPr>
           <w:rFonts w:ascii="Arial" w:hAnsi="Arial"/>
           <w:position w:val="2"/>
@@ -637,101 +630,35 @@
       </w:pPr>
       <w:r>
         <w:rPr>
-          <w:b/>
-          <w:sz w:val="20"/>
-        </w:rPr>
-        <w:t xml:space="preserve">Engineering production-grade microservice platforms </w:t>
-      </w:r>
-      <w:r>
-        <w:rPr>
-          <w:sz w:val="20"/>
-        </w:rPr>
-        <w:t xml:space="preserve">using </w:t>
-      </w:r>
-      <w:r>
-        <w:rPr>
-          <w:b/>
-          <w:sz w:val="20"/>
-        </w:rPr>
-        <w:t>Python</w:t>
-      </w:r>
-      <w:r>
-        <w:rPr>
-          <w:sz w:val="20"/>
-        </w:rPr>
-        <w:t xml:space="preserve">, </w:t>
-      </w:r>
-      <w:r>
-        <w:rPr>
-          <w:b/>
-          <w:sz w:val="20"/>
-        </w:rPr>
-        <w:t>FastAPI</w:t>
-      </w:r>
-      <w:r>
-        <w:rPr>
-          <w:sz w:val="20"/>
-        </w:rPr>
-        <w:t xml:space="preserve">, </w:t>
-      </w:r>
-      <w:r>
-        <w:rPr>
-          <w:b/>
-          <w:sz w:val="20"/>
-        </w:rPr>
-        <w:t>SQL</w:t>
-      </w:r>
-      <w:r>
-        <w:rPr>
-          <w:sz w:val="20"/>
-        </w:rPr>
-        <w:t>,</w:t>
+          <w:sz w:val="20"/>
+        </w:rPr>
+        <w:t>Engineering production-grade microservice platforms on Linux-based containers u</w:t>
       </w:r>
       <w:r>
         <w:rPr>
           <w:spacing w:val="18"/>
           <w:sz w:val="20"/>
         </w:rPr>
-        <w:t xml:space="preserve"> </w:t>
-      </w:r>
-      <w:r>
-        <w:rPr>
-          <w:b/>
-          <w:sz w:val="20"/>
-        </w:rPr>
-        <w:t>Docker</w:t>
-      </w:r>
-      <w:r>
-        <w:rPr>
-          <w:sz w:val="20"/>
-        </w:rPr>
-        <w:t xml:space="preserve">, and </w:t>
-      </w:r>
-      <w:r>
-        <w:rPr>
-          <w:b/>
-          <w:sz w:val="20"/>
-        </w:rPr>
-        <w:t>AWS EKS</w:t>
-      </w:r>
-      <w:r>
-        <w:rPr>
-          <w:sz w:val="20"/>
-        </w:rPr>
-        <w:t>, enabling</w:t>
+        <w:t>s</w:t>
+      </w:r>
+      <w:r>
+        <w:rPr>
+          <w:sz w:val="20"/>
+        </w:rPr>
+        <w:t>ing Python, FastAPI, SQL, Doc</w:t>
       </w:r>
       <w:r>
         <w:rPr>
           <w:spacing w:val="18"/>
           <w:sz w:val="20"/>
         </w:rPr>
-        <w:t xml:space="preserve"> </w:t>
-      </w:r>
-      <w:r>
-        <w:rPr>
-          <w:sz w:val="20"/>
-        </w:rPr>
-        <w:t>horizontally scalable, low-latency data pipelines handling multi-million-record workloads.</w:t>
+        <w:t>k</w:t>
+      </w:r>
+      <w:r>
+        <w:rPr>
+          <w:sz w:val="20"/>
+        </w:rPr>
+        <w:t>er, and AWS EKS, enabling horizontally scalable, low-latency data pipelines handling multi-million-record workloads.</w:t>
       </w:r>
     </w:p>
     <w:p>
@@ -745,7 +672,7 @@
           <w:tab w:val="left" w:pos="575"/>
         </w:tabs>
         <w:spacing w:before="5" w:line="225" w:lineRule="auto"/>
-        <w:ind w:left="575" w:hanging="185" w:right="358"/>
+        <w:ind w:right="358"/>
         <w:rPr>
           <w:rFonts w:ascii="Arial" w:hAnsi="Arial"/>
           <w:position w:val="2"/>
@@ -754,16 +681,9 @@
       </w:pPr>
       <w:r>
         <w:rPr>
-          <w:b/>
-          <w:sz w:val="20"/>
-        </w:rPr>
-        <w:t xml:space="preserve">Implementing enterprise-level RAG (Retrieval-Augmented Generation) pipelines </w:t>
-      </w:r>
-      <w:r>
-        <w:rPr>
-          <w:sz w:val="20"/>
-        </w:rPr>
-        <w:t>powered by</w:t>
+          <w:sz w:val="20"/>
+        </w:rPr>
+        <w:t>Implementing enterprise-level RAG (Retrieval-Augmented Generation) pipelines powered by</w:t>
       </w:r>
       <w:r>
         <w:rPr>
@@ -774,42 +694,9 @@
       </w:r>
       <w:r>
         <w:rPr>
-          <w:b/>
-          <w:sz w:val="20"/>
-        </w:rPr>
-        <w:t>FAISS</w:t>
-      </w:r>
-      <w:r>
-        <w:rPr>
-          <w:sz w:val="20"/>
-        </w:rPr>
-        <w:t xml:space="preserve">, </w:t>
-      </w:r>
-      <w:r>
-        <w:rPr>
-          <w:b/>
-          <w:sz w:val="20"/>
-        </w:rPr>
-        <w:t>LangChain</w:t>
-      </w:r>
-      <w:r>
-        <w:rPr>
-          <w:sz w:val="20"/>
-        </w:rPr>
-        <w:t xml:space="preserve">, and </w:t>
-      </w:r>
-      <w:r>
-        <w:rPr>
-          <w:b/>
-          <w:sz w:val="20"/>
-        </w:rPr>
-        <w:t>LLM APIs</w:t>
-      </w:r>
-      <w:r>
-        <w:rPr>
-          <w:sz w:val="20"/>
-        </w:rPr>
-        <w:t>, achieving near-real-time contextual retrieval with 90%+ precision on contract analytics.</w:t>
+          <w:sz w:val="20"/>
+        </w:rPr>
+        <w:t>FAISS, LangChain, and LLM APIs, achieving near-real-time contextual retrieval with 90%+ precision on contract analytics, employing distributed system principles and cutting-edge AI techniques.</w:t>
       </w:r>
     </w:p>
     <w:p>
@@ -823,7 +710,7 @@
           <w:tab w:val="left" w:pos="575"/>
         </w:tabs>
         <w:spacing w:before="3" w:line="230" w:lineRule="auto"/>
-        <w:ind w:left="575" w:hanging="185" w:right="349"/>
+        <w:ind w:right="349"/>
         <w:rPr>
           <w:rFonts w:ascii="Arial" w:hAnsi="Arial"/>
           <w:position w:val="2"/>
@@ -923,14 +810,12 @@
       </w:r>
       <w:r>
         <w:rPr>
-          <w:b/>
           <w:sz w:val="20"/>
         </w:rPr>
         <w:t>Prometheus,</w:t>
       </w:r>
       <w:r>
         <w:rPr>
-          <w:b/>
           <w:spacing w:val="-9"/>
           <w:sz w:val="20"/>
         </w:rPr>
@@ -938,14 +823,12 @@
       </w:r>
       <w:r>
         <w:rPr>
-          <w:b/>
           <w:sz w:val="20"/>
         </w:rPr>
         <w:t>Grafana,</w:t>
       </w:r>
       <w:r>
         <w:rPr>
-          <w:b/>
           <w:spacing w:val="-12"/>
           <w:sz w:val="20"/>
         </w:rPr>
@@ -966,14 +849,12 @@
       </w:r>
       <w:r>
         <w:rPr>
-          <w:b/>
           <w:sz w:val="20"/>
         </w:rPr>
         <w:t>CloudWatch,</w:t>
       </w:r>
       <w:r>
         <w:rPr>
-          <w:b/>
           <w:spacing w:val="-11"/>
           <w:sz w:val="20"/>
         </w:rPr>
@@ -1180,71 +1061,13 @@
           <w:spacing w:val="-2"/>
           <w:sz w:val="20"/>
         </w:rPr>
-        <w:t xml:space="preserve">Conceived and deployed a </w:t>
-      </w:r>
-      <w:r>
-        <w:rPr>
-          <w:b/>
-          <w:spacing w:val="-2"/>
-          <w:sz w:val="20"/>
-        </w:rPr>
-        <w:t xml:space="preserve">full-stack </w:t>
-      </w:r>
-      <w:r>
-        <w:rPr>
-          <w:spacing w:val="-2"/>
-          <w:sz w:val="20"/>
-        </w:rPr>
-        <w:t>Skills Intelligence Platform (</w:t>
-      </w:r>
-      <w:r>
-        <w:rPr>
-          <w:b/>
-          <w:spacing w:val="-2"/>
-          <w:sz w:val="20"/>
-        </w:rPr>
-        <w:t>FastAPI, React.js, Azure SQL, Docker</w:t>
-      </w:r>
-      <w:r>
-        <w:rPr>
-          <w:spacing w:val="-2"/>
-          <w:sz w:val="20"/>
-        </w:rPr>
-        <w:t xml:space="preserve">) adopted by </w:t>
-      </w:r>
-      <w:r>
-        <w:rPr>
-          <w:b/>
-          <w:spacing w:val="-2"/>
-          <w:sz w:val="20"/>
-        </w:rPr>
-        <w:t xml:space="preserve">2,000+ </w:t>
-      </w:r>
-      <w:r>
-        <w:rPr>
-          <w:spacing w:val="-2"/>
-          <w:sz w:val="20"/>
-        </w:rPr>
-        <w:t xml:space="preserve">employees, </w:t>
-      </w:r>
-      <w:r>
-        <w:rPr>
-          <w:sz w:val="20"/>
-        </w:rPr>
-        <w:t xml:space="preserve">automating talent discovery and slashing manual allocation time by </w:t>
-      </w:r>
-      <w:r>
-        <w:rPr>
-          <w:b/>
-          <w:sz w:val="20"/>
-        </w:rPr>
-        <w:t>60%</w:t>
-      </w:r>
-      <w:r>
-        <w:rPr>
-          <w:sz w:val="20"/>
-        </w:rPr>
-        <w:t>.</w:t>
+        <w:t xml:space="preserve">Conceived and deployed a full-stack Skills Intelligence Platform (FastAPI, React.js, Azure SQL, Docker) adopted by 2,000+ employees, </w:t>
+      </w:r>
+      <w:r>
+        <w:rPr>
+          <w:sz w:val="20"/>
+        </w:rPr>
+        <w:t>automating talent discovery and slashing manual allocation time by 60%.</w:t>
       </w:r>
     </w:p>
     <w:p>
@@ -1359,128 +1182,101 @@
         <w:rPr>
           <w:sz w:val="20"/>
         </w:rPr>
-        <w:t>leveraging</w:t>
+        <w:t>on Linux s</w:t>
       </w:r>
       <w:r>
         <w:rPr>
           <w:spacing w:val="27"/>
           <w:sz w:val="20"/>
         </w:rPr>
-        <w:t xml:space="preserve"> </w:t>
-      </w:r>
-      <w:r>
-        <w:rPr>
-          <w:b/>
-          <w:sz w:val="20"/>
-        </w:rPr>
-        <w:t>Spring</w:t>
-      </w:r>
-      <w:r>
-        <w:rPr>
-          <w:b/>
+        <w:t>e</w:t>
+      </w:r>
+      <w:r>
+        <w:rPr>
+          <w:sz w:val="20"/>
+        </w:rPr>
+        <w:t>rvers</w:t>
+      </w:r>
+      <w:r>
+        <w:rPr>
           <w:spacing w:val="23"/>
           <w:sz w:val="20"/>
         </w:rPr>
-        <w:t xml:space="preserve"> </w:t>
-      </w:r>
-      <w:r>
-        <w:rPr>
-          <w:b/>
-          <w:sz w:val="20"/>
-        </w:rPr>
-        <w:t>Boot</w:t>
-      </w:r>
-      <w:r>
-        <w:rPr>
-          <w:sz w:val="20"/>
-        </w:rPr>
-        <w:t>,</w:t>
+        <w:t>l</w:t>
+      </w:r>
+      <w:r>
+        <w:rPr>
+          <w:sz w:val="20"/>
+        </w:rPr>
+        <w:t>evera</w:t>
       </w:r>
       <w:r>
         <w:rPr>
           <w:spacing w:val="23"/>
           <w:sz w:val="20"/>
         </w:rPr>
-        <w:t xml:space="preserve"> </w:t>
-      </w:r>
-      <w:r>
-        <w:rPr>
-          <w:b/>
-          <w:sz w:val="20"/>
-        </w:rPr>
-        <w:t>Redis</w:t>
-      </w:r>
-      <w:r>
-        <w:rPr>
-          <w:sz w:val="20"/>
-        </w:rPr>
-        <w:t>,</w:t>
+        <w:t>g</w:t>
+      </w:r>
+      <w:r>
+        <w:rPr>
+          <w:sz w:val="20"/>
+        </w:rPr>
+        <w:t>ing Sp</w:t>
       </w:r>
       <w:r>
         <w:rPr>
           <w:spacing w:val="23"/>
           <w:sz w:val="20"/>
         </w:rPr>
-        <w:t xml:space="preserve"> </w:t>
-      </w:r>
-      <w:r>
-        <w:rPr>
-          <w:b/>
-          <w:sz w:val="20"/>
-        </w:rPr>
-        <w:t>Kafka</w:t>
-      </w:r>
-      <w:r>
-        <w:rPr>
-          <w:sz w:val="20"/>
-        </w:rPr>
-        <w:t>,</w:t>
+        <w:t>r</w:t>
+      </w:r>
+      <w:r>
+        <w:rPr>
+          <w:sz w:val="20"/>
+        </w:rPr>
+        <w:t>ing Bo</w:t>
       </w:r>
       <w:r>
         <w:rPr>
           <w:spacing w:val="23"/>
           <w:sz w:val="20"/>
         </w:rPr>
-        <w:t xml:space="preserve"> </w:t>
-      </w:r>
-      <w:r>
-        <w:rPr>
-          <w:sz w:val="20"/>
-        </w:rPr>
-        <w:t>and</w:t>
+        <w:t>o</w:t>
+      </w:r>
+      <w:r>
+        <w:rPr>
+          <w:sz w:val="20"/>
+        </w:rPr>
+        <w:t>t,</w:t>
       </w:r>
       <w:r>
         <w:rPr>
           <w:spacing w:val="24"/>
           <w:sz w:val="20"/>
         </w:rPr>
-        <w:t xml:space="preserve"> </w:t>
-      </w:r>
-      <w:r>
-        <w:rPr>
-          <w:b/>
-          <w:sz w:val="20"/>
-        </w:rPr>
-        <w:t>Hugging</w:t>
-      </w:r>
-      <w:r>
-        <w:rPr>
-          <w:b/>
+        <w:t>R</w:t>
+      </w:r>
+      <w:r>
+        <w:rPr>
+          <w:sz w:val="20"/>
+        </w:rPr>
+        <w:t>edis, K</w:t>
+      </w:r>
+      <w:r>
+        <w:rPr>
           <w:spacing w:val="23"/>
           <w:sz w:val="20"/>
         </w:rPr>
-        <w:t xml:space="preserve"> </w:t>
-      </w:r>
-      <w:r>
-        <w:rPr>
-          <w:b/>
-          <w:sz w:val="20"/>
-        </w:rPr>
-        <w:t>Face</w:t>
-      </w:r>
-      <w:r>
-        <w:rPr>
-          <w:b/>
+        <w:t>a</w:t>
+      </w:r>
+      <w:r>
+        <w:rPr>
+          <w:sz w:val="20"/>
+        </w:rPr>
+        <w:t>fka,</w:t>
+      </w:r>
+      <w:r>
+        <w:rPr>
           <w:spacing w:val="22"/>
           <w:sz w:val="20"/>
         </w:rPr>
@@ -1488,42 +1284,9 @@
       </w:r>
       <w:r>
         <w:rPr>
-          <w:b/>
-          <w:sz w:val="20"/>
-        </w:rPr>
-        <w:t>Transformers</w:t>
-      </w:r>
-      <w:r>
-        <w:rPr>
-          <w:sz w:val="20"/>
-        </w:rPr>
-        <w:t xml:space="preserve">, delivering </w:t>
-      </w:r>
-      <w:r>
-        <w:rPr>
-          <w:b/>
-          <w:sz w:val="20"/>
-        </w:rPr>
-        <w:t xml:space="preserve">1,000+ real-time document </w:t>
-      </w:r>
-      <w:r>
-        <w:rPr>
-          <w:sz w:val="20"/>
-        </w:rPr>
-        <w:t xml:space="preserve">inferences/day while reducing query latency by </w:t>
-      </w:r>
-      <w:r>
-        <w:rPr>
-          <w:b/>
-          <w:sz w:val="20"/>
-        </w:rPr>
-        <w:t>70%</w:t>
-      </w:r>
-      <w:r>
-        <w:rPr>
-          <w:sz w:val="20"/>
-        </w:rPr>
-        <w:t>.</w:t>
+          <w:sz w:val="20"/>
+        </w:rPr>
+        <w:t>and Hugging Face Transformers, delivering 1,000+ real-time document inferences/day while reducing query latency by 70%.</w:t>
       </w:r>
     </w:p>
     <w:p>
@@ -1601,7 +1364,6 @@
       </w:r>
       <w:r>
         <w:rPr>
-          <w:b/>
           <w:spacing w:val="-2"/>
           <w:sz w:val="20"/>
         </w:rPr>
@@ -1609,7 +1371,6 @@
       </w:r>
       <w:r>
         <w:rPr>
-          <w:b/>
           <w:spacing w:val="4"/>
           <w:sz w:val="20"/>
         </w:rPr>
@@ -1617,7 +1378,6 @@
       </w:r>
       <w:r>
         <w:rPr>
-          <w:b/>
           <w:spacing w:val="-2"/>
           <w:sz w:val="20"/>
         </w:rPr>
@@ -1625,7 +1385,6 @@
       </w:r>
       <w:r>
         <w:rPr>
-          <w:b/>
           <w:spacing w:val="-1"/>
           <w:sz w:val="20"/>
         </w:rPr>
@@ -1633,7 +1392,6 @@
       </w:r>
       <w:r>
         <w:rPr>
-          <w:b/>
           <w:spacing w:val="-2"/>
           <w:sz w:val="20"/>
         </w:rPr>
@@ -1641,7 +1399,6 @@
       </w:r>
       <w:r>
         <w:rPr>
-          <w:b/>
           <w:spacing w:val="5"/>
           <w:sz w:val="20"/>
         </w:rPr>
@@ -1652,19 +1409,10 @@
           <w:spacing w:val="-2"/>
           <w:sz w:val="20"/>
         </w:rPr>
-        <w:t>(</w:t>
-      </w:r>
-      <w:r>
-        <w:rPr>
-          <w:b/>
-          <w:spacing w:val="-2"/>
-          <w:sz w:val="20"/>
-        </w:rPr>
-        <w:t>FAISS,</w:t>
-      </w:r>
-      <w:r>
-        <w:rPr>
-          <w:b/>
+        <w:t>(FAISS,</w:t>
+      </w:r>
+      <w:r>
+        <w:rPr>
           <w:spacing w:val="1"/>
           <w:sz w:val="20"/>
         </w:rPr>
@@ -1672,7 +1420,6 @@
       </w:r>
       <w:r>
         <w:rPr>
-          <w:b/>
           <w:spacing w:val="-2"/>
           <w:sz w:val="20"/>
         </w:rPr>
@@ -1680,7 +1427,6 @@
       </w:r>
       <w:r>
         <w:rPr>
-          <w:b/>
           <w:spacing w:val="7"/>
           <w:sz w:val="20"/>
         </w:rPr>
@@ -1688,7 +1434,6 @@
       </w:r>
       <w:r>
         <w:rPr>
-          <w:b/>
           <w:spacing w:val="-2"/>
           <w:sz w:val="20"/>
         </w:rPr>
@@ -1696,7 +1441,6 @@
       </w:r>
       <w:r>
         <w:rPr>
-          <w:b/>
           <w:spacing w:val="1"/>
           <w:sz w:val="20"/>
         </w:rPr>
@@ -1704,7 +1448,6 @@
       </w:r>
       <w:r>
         <w:rPr>
-          <w:b/>
           <w:spacing w:val="-2"/>
           <w:sz w:val="20"/>
         </w:rPr>
@@ -1712,7 +1455,6 @@
       </w:r>
       <w:r>
         <w:rPr>
-          <w:b/>
           <w:spacing w:val="7"/>
           <w:sz w:val="20"/>
         </w:rPr>
@@ -1720,7 +1462,6 @@
       </w:r>
       <w:r>
         <w:rPr>
-          <w:b/>
           <w:spacing w:val="-2"/>
           <w:sz w:val="20"/>
         </w:rPr>
@@ -1728,7 +1469,6 @@
       </w:r>
       <w:r>
         <w:rPr>
-          <w:b/>
           <w:spacing w:val="5"/>
           <w:sz w:val="20"/>
         </w:rPr>
@@ -1736,7 +1476,6 @@
       </w:r>
       <w:r>
         <w:rPr>
-          <w:b/>
           <w:spacing w:val="-2"/>
           <w:sz w:val="20"/>
         </w:rPr>
@@ -1744,7 +1483,6 @@
       </w:r>
       <w:r>
         <w:rPr>
-          <w:b/>
           <w:spacing w:val="5"/>
           <w:sz w:val="20"/>
         </w:rPr>
@@ -1766,7 +1504,6 @@
       </w:r>
       <w:r>
         <w:rPr>
-          <w:b/>
           <w:spacing w:val="-5"/>
           <w:sz w:val="20"/>
         </w:rPr>
@@ -1906,14 +1643,12 @@
       </w:r>
       <w:r>
         <w:rPr>
-          <w:b/>
           <w:sz w:val="20"/>
         </w:rPr>
         <w:t>CI/CD</w:t>
       </w:r>
       <w:r>
         <w:rPr>
-          <w:b/>
           <w:spacing w:val="32"/>
           <w:sz w:val="20"/>
         </w:rPr>
@@ -1921,14 +1656,12 @@
       </w:r>
       <w:r>
         <w:rPr>
-          <w:b/>
           <w:sz w:val="20"/>
         </w:rPr>
         <w:t>pipelines</w:t>
       </w:r>
       <w:r>
         <w:rPr>
-          <w:b/>
           <w:spacing w:val="39"/>
           <w:sz w:val="20"/>
         </w:rPr>
@@ -1949,14 +1682,12 @@
       </w:r>
       <w:r>
         <w:rPr>
-          <w:b/>
           <w:sz w:val="20"/>
         </w:rPr>
         <w:t>GitHub</w:t>
       </w:r>
       <w:r>
         <w:rPr>
-          <w:b/>
           <w:spacing w:val="31"/>
           <w:sz w:val="20"/>
         </w:rPr>
@@ -1964,14 +1695,12 @@
       </w:r>
       <w:r>
         <w:rPr>
-          <w:b/>
           <w:sz w:val="20"/>
         </w:rPr>
         <w:t>Actions</w:t>
       </w:r>
       <w:r>
         <w:rPr>
-          <w:b/>
           <w:spacing w:val="34"/>
           <w:sz w:val="20"/>
         </w:rPr>
@@ -1992,16 +1721,9 @@
       </w:r>
       <w:r>
         <w:rPr>
-          <w:b/>
-          <w:sz w:val="20"/>
-        </w:rPr>
-        <w:t>Jenkins</w:t>
-      </w:r>
-      <w:r>
-        <w:rPr>
-          <w:sz w:val="20"/>
-        </w:rPr>
-        <w:t>,</w:t>
+          <w:sz w:val="20"/>
+        </w:rPr>
+        <w:t>Jenkins,</w:t>
       </w:r>
       <w:r>
         <w:rPr>
@@ -2053,20 +1775,7 @@
         <w:rPr>
           <w:sz w:val="20"/>
         </w:rPr>
-        <w:t xml:space="preserve">and proactive telemetry on </w:t>
-      </w:r>
-      <w:r>
-        <w:rPr>
-          <w:b/>
-          <w:sz w:val="20"/>
-        </w:rPr>
-        <w:t xml:space="preserve">Azure Kubernetes Service (AKS) </w:t>
-      </w:r>
-      <w:r>
-        <w:rPr>
-          <w:sz w:val="20"/>
-        </w:rPr>
-        <w:t>clusters.</w:t>
+        <w:t>and proactive telemetry on Azure Kubernetes Service (AKS) clusters.</w:t>
       </w:r>
     </w:p>
     <w:p>
@@ -2269,46 +1978,7 @@
         <w:rPr>
           <w:sz w:val="20"/>
         </w:rPr>
-        <w:t xml:space="preserve">Led end-to-end architecture and delivery of a </w:t>
-      </w:r>
-      <w:r>
-        <w:rPr>
-          <w:b/>
-          <w:sz w:val="20"/>
-        </w:rPr>
-        <w:t xml:space="preserve">cloud-native </w:t>
-      </w:r>
-      <w:r>
-        <w:rPr>
-          <w:sz w:val="20"/>
-        </w:rPr>
-        <w:t>client portal (</w:t>
-      </w:r>
-      <w:r>
-        <w:rPr>
-          <w:b/>
-          <w:sz w:val="20"/>
-        </w:rPr>
-        <w:t>Flask/Django, React.js, MongoDB</w:t>
-      </w:r>
-      <w:r>
-        <w:rPr>
-          <w:sz w:val="20"/>
-        </w:rPr>
-        <w:t xml:space="preserve">), automating manual workflows and cutting operational latency by </w:t>
-      </w:r>
-      <w:r>
-        <w:rPr>
-          <w:b/>
-          <w:sz w:val="20"/>
-        </w:rPr>
-        <w:t>70%</w:t>
-      </w:r>
-      <w:r>
-        <w:rPr>
-          <w:sz w:val="20"/>
-        </w:rPr>
-        <w:t>.</w:t>
+        <w:t>Led end-to-end architecture and delivery of a cutting-edge, cloud-native client portal on Linux servers using Flask/Django, React.js, and MongoDB, automating manual workflows and cutting operational latency by 70%.</w:t>
       </w:r>
     </w:p>
     <w:p>
@@ -2356,14 +2026,12 @@
       </w:r>
       <w:r>
         <w:rPr>
-          <w:b/>
           <w:sz w:val="20"/>
         </w:rPr>
         <w:t>Node.js</w:t>
       </w:r>
       <w:r>
         <w:rPr>
-          <w:b/>
           <w:spacing w:val="39"/>
           <w:sz w:val="20"/>
         </w:rPr>
@@ -2371,14 +2039,12 @@
       </w:r>
       <w:r>
         <w:rPr>
-          <w:b/>
           <w:sz w:val="20"/>
         </w:rPr>
         <w:t>microservices</w:t>
       </w:r>
       <w:r>
         <w:rPr>
-          <w:b/>
           <w:spacing w:val="40"/>
           <w:sz w:val="20"/>
         </w:rPr>
@@ -2412,16 +2078,9 @@
       </w:r>
       <w:r>
         <w:rPr>
-          <w:b/>
-          <w:sz w:val="20"/>
-        </w:rPr>
-        <w:t>PostgreSQL</w:t>
-      </w:r>
-      <w:r>
-        <w:rPr>
-          <w:sz w:val="20"/>
-        </w:rPr>
-        <w:t>,</w:t>
+          <w:sz w:val="20"/>
+        </w:rPr>
+        <w:t>PostgreSQL,</w:t>
       </w:r>
       <w:r>
         <w:rPr>
@@ -2445,14 +2104,12 @@
       </w:r>
       <w:r>
         <w:rPr>
-          <w:b/>
           <w:sz w:val="20"/>
         </w:rPr>
         <w:t>sub-100ms</w:t>
       </w:r>
       <w:r>
         <w:rPr>
-          <w:b/>
           <w:spacing w:val="40"/>
           <w:sz w:val="20"/>
         </w:rPr>
@@ -2549,29 +2206,25 @@
       </w:r>
       <w:r>
         <w:rPr>
-          <w:b/>
           <w:sz w:val="20"/>
         </w:rPr>
         <w:t>serverless</w:t>
       </w:r>
       <w:r>
         <w:rPr>
-          <w:b/>
-          <w:spacing w:val="-2"/>
-          <w:sz w:val="20"/>
-        </w:rPr>
-        <w:t xml:space="preserve"> </w:t>
-      </w:r>
-      <w:r>
-        <w:rPr>
-          <w:b/>
+          <w:spacing w:val="-2"/>
+          <w:sz w:val="20"/>
+        </w:rPr>
+        <w:t xml:space="preserve"> </w:t>
+      </w:r>
+      <w:r>
+        <w:rPr>
           <w:sz w:val="20"/>
         </w:rPr>
         <w:t>computing</w:t>
       </w:r>
       <w:r>
         <w:rPr>
-          <w:b/>
           <w:spacing w:val="-3"/>
           <w:sz w:val="20"/>
         </w:rPr>
@@ -2579,16 +2232,9 @@
       </w:r>
       <w:r>
         <w:rPr>
-          <w:b/>
-          <w:sz w:val="20"/>
-        </w:rPr>
-        <w:t xml:space="preserve">environment </w:t>
-      </w:r>
-      <w:r>
-        <w:rPr>
-          <w:sz w:val="20"/>
-        </w:rPr>
-        <w:t>on</w:t>
+          <w:sz w:val="20"/>
+        </w:rPr>
+        <w:t>environment on</w:t>
       </w:r>
       <w:r>
         <w:rPr>
@@ -2599,31 +2245,22 @@
       </w:r>
       <w:r>
         <w:rPr>
-          <w:b/>
           <w:sz w:val="20"/>
         </w:rPr>
         <w:t>AWS</w:t>
       </w:r>
       <w:r>
         <w:rPr>
-          <w:b/>
-          <w:spacing w:val="-2"/>
-          <w:sz w:val="20"/>
-        </w:rPr>
-        <w:t xml:space="preserve"> </w:t>
-      </w:r>
-      <w:r>
-        <w:rPr>
-          <w:b/>
-          <w:sz w:val="20"/>
-        </w:rPr>
-        <w:t>Lambda</w:t>
-      </w:r>
-      <w:r>
-        <w:rPr>
-          <w:sz w:val="20"/>
-        </w:rPr>
-        <w:t>,</w:t>
+          <w:spacing w:val="-2"/>
+          <w:sz w:val="20"/>
+        </w:rPr>
+        <w:t xml:space="preserve"> </w:t>
+      </w:r>
+      <w:r>
+        <w:rPr>
+          <w:sz w:val="20"/>
+        </w:rPr>
+        <w:t>Lambda,</w:t>
       </w:r>
       <w:r>
         <w:rPr>
@@ -2634,14 +2271,12 @@
       </w:r>
       <w:r>
         <w:rPr>
-          <w:b/>
           <w:sz w:val="20"/>
         </w:rPr>
         <w:t>API</w:t>
       </w:r>
       <w:r>
         <w:rPr>
-          <w:b/>
           <w:spacing w:val="-1"/>
           <w:sz w:val="20"/>
         </w:rPr>
@@ -2649,16 +2284,9 @@
       </w:r>
       <w:r>
         <w:rPr>
-          <w:b/>
-          <w:sz w:val="20"/>
-        </w:rPr>
-        <w:t>Gateway</w:t>
-      </w:r>
-      <w:r>
-        <w:rPr>
-          <w:sz w:val="20"/>
-        </w:rPr>
-        <w:t>,</w:t>
+          <w:sz w:val="20"/>
+        </w:rPr>
+        <w:t>Gateway,</w:t>
       </w:r>
       <w:r>
         <w:rPr>
@@ -2669,16 +2297,9 @@
       </w:r>
       <w:r>
         <w:rPr>
-          <w:b/>
-          <w:sz w:val="20"/>
-        </w:rPr>
-        <w:t>S3</w:t>
-      </w:r>
-      <w:r>
-        <w:rPr>
-          <w:sz w:val="20"/>
-        </w:rPr>
-        <w:t>,</w:t>
+          <w:sz w:val="20"/>
+        </w:rPr>
+        <w:t>S3,</w:t>
       </w:r>
       <w:r>
         <w:rPr>
@@ -2702,16 +2323,9 @@
       </w:r>
       <w:r>
         <w:rPr>
-          <w:b/>
-          <w:sz w:val="20"/>
-        </w:rPr>
-        <w:t>RDS</w:t>
-      </w:r>
-      <w:r>
-        <w:rPr>
-          <w:sz w:val="20"/>
-        </w:rPr>
-        <w:t>,</w:t>
+          <w:sz w:val="20"/>
+        </w:rPr>
+        <w:t>RDS,</w:t>
       </w:r>
       <w:r>
         <w:rPr>
@@ -2735,14 +2349,12 @@
       </w:r>
       <w:r>
         <w:rPr>
-          <w:b/>
           <w:sz w:val="20"/>
         </w:rPr>
         <w:t>99.9%</w:t>
       </w:r>
       <w:r>
         <w:rPr>
-          <w:b/>
           <w:spacing w:val="-4"/>
           <w:sz w:val="20"/>
         </w:rPr>
@@ -2750,14 +2362,12 @@
       </w:r>
       <w:r>
         <w:rPr>
-          <w:b/>
           <w:sz w:val="20"/>
         </w:rPr>
         <w:t>uptime</w:t>
       </w:r>
       <w:r>
         <w:rPr>
-          <w:b/>
           <w:spacing w:val="-7"/>
           <w:sz w:val="20"/>
         </w:rPr>
@@ -2767,20 +2377,7 @@
         <w:rPr>
           <w:sz w:val="20"/>
         </w:rPr>
-        <w:t xml:space="preserve">while lowering infrastructure spend by </w:t>
-      </w:r>
-      <w:r>
-        <w:rPr>
-          <w:b/>
-          <w:sz w:val="20"/>
-        </w:rPr>
-        <w:t xml:space="preserve">30% </w:t>
-      </w:r>
-      <w:r>
-        <w:rPr>
-          <w:sz w:val="20"/>
-        </w:rPr>
-        <w:t>through elastic scaling.</w:t>
+        <w:t>with Linux-based infrastructure while lowering infrastructure spend by 30% through elastic scaling.</w:t>
       </w:r>
     </w:p>
     <w:p>
@@ -2815,29 +2412,25 @@
       </w:r>
       <w:r>
         <w:rPr>
-          <w:b/>
           <w:sz w:val="20"/>
         </w:rPr>
         <w:t>DevOps</w:t>
       </w:r>
       <w:r>
         <w:rPr>
-          <w:b/>
-          <w:spacing w:val="-2"/>
-          <w:sz w:val="20"/>
-        </w:rPr>
-        <w:t xml:space="preserve"> </w:t>
-      </w:r>
-      <w:r>
-        <w:rPr>
-          <w:b/>
+          <w:spacing w:val="-2"/>
+          <w:sz w:val="20"/>
+        </w:rPr>
+        <w:t xml:space="preserve"> </w:t>
+      </w:r>
+      <w:r>
+        <w:rPr>
           <w:sz w:val="20"/>
         </w:rPr>
         <w:t>excellence</w:t>
       </w:r>
       <w:r>
         <w:rPr>
-          <w:b/>
           <w:spacing w:val="-2"/>
           <w:sz w:val="20"/>
         </w:rPr>
@@ -2858,36 +2451,22 @@
       </w:r>
       <w:r>
         <w:rPr>
-          <w:b/>
-          <w:sz w:val="20"/>
-        </w:rPr>
-        <w:t>Agile</w:t>
-      </w:r>
-      <w:r>
-        <w:rPr>
-          <w:sz w:val="20"/>
-        </w:rPr>
-        <w:t>,</w:t>
-      </w:r>
-      <w:r>
-        <w:rPr>
-          <w:spacing w:val="-2"/>
-          <w:sz w:val="20"/>
-        </w:rPr>
-        <w:t xml:space="preserve"> </w:t>
-      </w:r>
-      <w:r>
-        <w:rPr>
-          <w:b/>
-          <w:sz w:val="20"/>
-        </w:rPr>
-        <w:t>TDD</w:t>
-      </w:r>
-      <w:r>
-        <w:rPr>
-          <w:sz w:val="20"/>
-        </w:rPr>
-        <w:t>,</w:t>
+          <w:sz w:val="20"/>
+        </w:rPr>
+        <w:t>Agile,</w:t>
+      </w:r>
+      <w:r>
+        <w:rPr>
+          <w:spacing w:val="-2"/>
+          <w:sz w:val="20"/>
+        </w:rPr>
+        <w:t xml:space="preserve"> </w:t>
+      </w:r>
+      <w:r>
+        <w:rPr>
+          <w:sz w:val="20"/>
+        </w:rPr>
+        <w:t>TDD,</w:t>
       </w:r>
       <w:r>
         <w:rPr>
@@ -2911,31 +2490,22 @@
       </w:r>
       <w:r>
         <w:rPr>
-          <w:b/>
           <w:sz w:val="20"/>
         </w:rPr>
         <w:t>performance-tuning</w:t>
       </w:r>
       <w:r>
         <w:rPr>
-          <w:b/>
-          <w:spacing w:val="-2"/>
-          <w:sz w:val="20"/>
-        </w:rPr>
-        <w:t xml:space="preserve"> </w:t>
-      </w:r>
-      <w:r>
-        <w:rPr>
-          <w:b/>
-          <w:sz w:val="20"/>
-        </w:rPr>
-        <w:t>sprints</w:t>
-      </w:r>
-      <w:r>
-        <w:rPr>
-          <w:sz w:val="20"/>
-        </w:rPr>
-        <w:t>,</w:t>
+          <w:spacing w:val="-2"/>
+          <w:sz w:val="20"/>
+        </w:rPr>
+        <w:t xml:space="preserve"> </w:t>
+      </w:r>
+      <w:r>
+        <w:rPr>
+          <w:sz w:val="20"/>
+        </w:rPr>
+        <w:t>sprints,</w:t>
       </w:r>
       <w:r>
         <w:rPr>
@@ -3000,20 +2570,7 @@
         <w:rPr>
           <w:sz w:val="20"/>
         </w:rPr>
-        <w:t xml:space="preserve">accelerating feature delivery velocity by </w:t>
-      </w:r>
-      <w:r>
-        <w:rPr>
-          <w:b/>
-          <w:sz w:val="20"/>
-        </w:rPr>
-        <w:t>45%</w:t>
-      </w:r>
-      <w:r>
-        <w:rPr>
-          <w:sz w:val="20"/>
-        </w:rPr>
-        <w:t>.</w:t>
+        <w:t>accelerating feature delivery velocity by 45%.</w:t>
       </w:r>
     </w:p>
     <w:p>
@@ -3022,14 +2579,16 @@
         <w:ind w:left="360"/>
         <w:rPr>
           <w:b/>
-          <w:sz w:val="20"/>
+          <w:sz w:val="21"/>
+          <w:szCs w:val="24"/>
         </w:rPr>
       </w:pPr>
       <w:r>
         <w:rPr>
           <w:b/>
           <w:noProof/>
-          <w:sz w:val="20"/>
+          <w:sz w:val="21"/>
+          <w:szCs w:val="24"/>
         </w:rPr>
         <mc:AlternateContent>
           <mc:Choice Requires="wps">
@@ -3117,9 +2676,19 @@
         <w:rPr>
           <w:b/>
           <w:spacing w:val="-2"/>
-          <w:sz w:val="20"/>
-        </w:rPr>
-        <w:t>EDUCATION</w:t>
+          <w:sz w:val="21"/>
+          <w:szCs w:val="24"/>
+        </w:rPr>
+        <w:t>E</w:t>
+      </w:r>
+      <w:r>
+        <w:rPr>
+          <w:b/>
+          <w:spacing w:val="-2"/>
+          <w:sz w:val="21"/>
+          <w:szCs w:val="24"/>
+        </w:rPr>
+        <w:t>ducation</w:t>
       </w:r>
     </w:p>
     <w:p>
@@ -3674,23 +3243,14 @@
           <w:b/>
           <w:sz w:val="20"/>
         </w:rPr>
-        <w:t>TECHNICAL</w:t>
-      </w:r>
-      <w:r>
-        <w:rPr>
-          <w:b/>
-          <w:spacing w:val="-12"/>
-          <w:sz w:val="20"/>
-        </w:rPr>
-        <w:t xml:space="preserve"> </w:t>
-      </w:r>
-      <w:r>
-        <w:rPr>
-          <w:b/>
-          <w:spacing w:val="-2"/>
-          <w:sz w:val="20"/>
-        </w:rPr>
-        <w:t>SKILLS</w:t>
+        <w:t>T</w:t>
+      </w:r>
+      <w:r>
+        <w:rPr>
+          <w:b/>
+          <w:sz w:val="20"/>
+        </w:rPr>
+        <w:t>echnical Skills</w:t>
       </w:r>
     </w:p>
     <w:p>
@@ -3749,7 +3309,25 @@
         <w:t xml:space="preserve"> </w:t>
       </w:r>
       <w:r>
-        <w:t>HTML,</w:t>
+        <w:t>Shell</w:t>
+      </w:r>
+      <w:r>
+        <w:rPr>
+          <w:spacing w:val="-2"/>
+        </w:rPr>
+        <w:t xml:space="preserve"> </w:t>
+      </w:r>
+      <w:r>
+        <w:t>Scri</w:t>
+      </w:r>
+      <w:r>
+        <w:rPr>
+          <w:spacing w:val="-2"/>
+        </w:rPr>
+        <w:t>p</w:t>
+      </w:r>
+      <w:r>
+        <w:t>ting, HTML,</w:t>
       </w:r>
       <w:r>
         <w:rPr>
@@ -3767,16 +3345,16 @@
         <w:t xml:space="preserve"> </w:t>
       </w:r>
       <w:r>
-        <w:t>JavaScript,</w:t>
-      </w:r>
-      <w:r>
-        <w:rPr>
-          <w:spacing w:val="-2"/>
-        </w:rPr>
-        <w:t xml:space="preserve"> </w:t>
-      </w:r>
-      <w:r>
-        <w:t>SQL,</w:t>
+        <w:t>Java</w:t>
+      </w:r>
+      <w:r>
+        <w:rPr>
+          <w:spacing w:val="-2"/>
+        </w:rPr>
+        <w:t>S</w:t>
+      </w:r>
+      <w:r>
+        <w:t>cript, SQL,</w:t>
       </w:r>
       <w:r>
         <w:rPr>
@@ -3789,33 +3367,15 @@
       </w:r>
       <w:r>
         <w:rPr>
-          <w:spacing w:val="-2"/>
-        </w:rPr>
-        <w:t xml:space="preserve"> </w:t>
-      </w:r>
-      <w:r>
-        <w:t>Typescript,</w:t>
-      </w:r>
-      <w:r>
-        <w:rPr>
-          <w:spacing w:val="-2"/>
-        </w:rPr>
-        <w:t xml:space="preserve"> </w:t>
-      </w:r>
-      <w:r>
-        <w:t>Ruby,</w:t>
-      </w:r>
-      <w:r>
-        <w:rPr>
           <w:spacing w:val="-1"/>
         </w:rPr>
-        <w:t xml:space="preserve"> </w:t>
+        <w:t>T</w:t>
       </w:r>
       <w:r>
         <w:rPr>
           <w:spacing w:val="-5"/>
         </w:rPr>
-        <w:t>Go.</w:t>
+        <w:t>ypescript, Ruby, Go.</w:t>
       </w:r>
     </w:p>
     <w:p>
@@ -3823,6 +3383,7 @@
         <w:spacing w:before="41" w:line="280" w:lineRule="auto"/>
         <w:ind w:left="360" w:right="792"/>
         <w:rPr>
+          <w:b/>
           <w:sz w:val="20"/>
         </w:rPr>
       </w:pPr>
@@ -3988,33 +3549,62 @@
         <w:rPr>
           <w:sz w:val="20"/>
         </w:rPr>
-        <w:t>Oracle,</w:t>
+        <w:t>Linux,</w:t>
       </w:r>
       <w:r>
         <w:rPr>
           <w:spacing w:val="-3"/>
           <w:sz w:val="20"/>
         </w:rPr>
-        <w:t xml:space="preserve"> </w:t>
-      </w:r>
-      <w:r>
-        <w:rPr>
-          <w:sz w:val="20"/>
-        </w:rPr>
-        <w:t xml:space="preserve">Postgres. </w:t>
-      </w:r>
-      <w:r>
-        <w:rPr>
-          <w:b/>
-          <w:sz w:val="20"/>
-        </w:rPr>
-        <w:t xml:space="preserve">Other Technologies: </w:t>
-      </w:r>
-      <w:r>
-        <w:rPr>
-          <w:sz w:val="20"/>
-        </w:rPr>
-        <w:t>AWS, Docker, Kubernetes, NumPy, Pandas, Cassandra, LangChain, Maven.</w:t>
+        <w:t>O</w:t>
+      </w:r>
+      <w:r>
+        <w:rPr>
+          <w:sz w:val="20"/>
+        </w:rPr>
+        <w:t xml:space="preserve">racle, </w:t>
+      </w:r>
+      <w:r>
+        <w:rPr>
+          <w:sz w:val="20"/>
+        </w:rPr>
+        <w:t>Postgres.</w:t>
+      </w:r>
+      <w:r>
+        <w:rPr>
+          <w:b/>
+          <w:sz w:val="20"/>
+        </w:rPr>
+        <w:t xml:space="preserve"> </w:t>
+      </w:r>
+    </w:p>
+    <w:p>
+      <w:pPr>
+        <w:spacing w:before="41" w:line="280" w:lineRule="auto"/>
+        <w:ind w:left="360" w:right="792"/>
+        <w:rPr>
+          <w:sz w:val="20"/>
+        </w:rPr>
+      </w:pPr>
+      <w:r>
+        <w:rPr>
+          <w:b/>
+          <w:sz w:val="20"/>
+        </w:rPr>
+        <w:t xml:space="preserve">Other </w:t>
+      </w:r>
+      <w:r>
+        <w:rPr>
+          <w:b/>
+          <w:sz w:val="20"/>
+        </w:rPr>
+        <w:t>Technologies:</w:t>
+      </w:r>
+      <w:r>
+        <w:rPr>
+          <w:sz w:val="20"/>
+        </w:rPr>
+        <w:t xml:space="preserve"> AWS, Docker, Kubernetes, NumPy, Pandas, Cassandra, LangChain, Maven.</w:t>
       </w:r>
     </w:p>
     <w:p>
@@ -4120,7 +3710,15 @@
           <w:spacing w:val="-2"/>
           <w:sz w:val="20"/>
         </w:rPr>
-        <w:t>PROJECTS</w:t>
+        <w:t>P</w:t>
+      </w:r>
+      <w:r>
+        <w:rPr>
+          <w:b/>
+          <w:spacing w:val="-2"/>
+          <w:sz w:val="20"/>
+        </w:rPr>
+        <w:t>rojects</w:t>
       </w:r>
     </w:p>
     <w:p>
@@ -4275,14 +3873,12 @@
       </w:r>
       <w:r>
         <w:rPr>
-          <w:b/>
           <w:sz w:val="20"/>
         </w:rPr>
         <w:t>AI-driven</w:t>
       </w:r>
       <w:r>
         <w:rPr>
-          <w:b/>
           <w:spacing w:val="27"/>
           <w:sz w:val="20"/>
         </w:rPr>
@@ -4290,14 +3886,12 @@
       </w:r>
       <w:r>
         <w:rPr>
-          <w:b/>
           <w:sz w:val="20"/>
         </w:rPr>
         <w:t>monitoring</w:t>
       </w:r>
       <w:r>
         <w:rPr>
-          <w:b/>
           <w:spacing w:val="34"/>
           <w:sz w:val="20"/>
         </w:rPr>
@@ -4305,14 +3899,12 @@
       </w:r>
       <w:r>
         <w:rPr>
-          <w:b/>
           <w:sz w:val="20"/>
         </w:rPr>
         <w:t>platform</w:t>
       </w:r>
       <w:r>
         <w:rPr>
-          <w:b/>
           <w:spacing w:val="34"/>
           <w:sz w:val="20"/>
         </w:rPr>
@@ -4398,14 +3990,12 @@
       </w:r>
       <w:r>
         <w:rPr>
-          <w:b/>
           <w:sz w:val="20"/>
         </w:rPr>
         <w:t>logs,</w:t>
       </w:r>
       <w:r>
         <w:rPr>
-          <w:b/>
           <w:spacing w:val="29"/>
           <w:sz w:val="20"/>
         </w:rPr>
@@ -4413,14 +4003,12 @@
       </w:r>
       <w:r>
         <w:rPr>
-          <w:b/>
           <w:sz w:val="20"/>
         </w:rPr>
         <w:t>metrics,</w:t>
       </w:r>
       <w:r>
         <w:rPr>
-          <w:b/>
           <w:spacing w:val="29"/>
           <w:sz w:val="20"/>
         </w:rPr>
@@ -4428,14 +4016,12 @@
       </w:r>
       <w:r>
         <w:rPr>
-          <w:b/>
           <w:sz w:val="20"/>
         </w:rPr>
         <w:t>and</w:t>
       </w:r>
       <w:r>
         <w:rPr>
-          <w:b/>
           <w:spacing w:val="31"/>
           <w:sz w:val="20"/>
         </w:rPr>
@@ -4443,14 +4029,12 @@
       </w:r>
       <w:r>
         <w:rPr>
-          <w:b/>
           <w:sz w:val="20"/>
         </w:rPr>
         <w:t>user</w:t>
       </w:r>
       <w:r>
         <w:rPr>
-          <w:b/>
           <w:spacing w:val="32"/>
           <w:sz w:val="20"/>
         </w:rPr>
@@ -4458,29 +4042,9 @@
       </w:r>
       <w:r>
         <w:rPr>
-          <w:b/>
-          <w:sz w:val="20"/>
-        </w:rPr>
-        <w:t>behavior</w:t>
-      </w:r>
-      <w:r>
-        <w:rPr>
-          <w:sz w:val="20"/>
-        </w:rPr>
-        <w:t xml:space="preserve">, leveraging </w:t>
-      </w:r>
-      <w:r>
-        <w:rPr>
-          <w:b/>
-          <w:sz w:val="20"/>
-        </w:rPr>
-        <w:t xml:space="preserve">Kafka, Spark, and AWS Kinesis </w:t>
-      </w:r>
-      <w:r>
-        <w:rPr>
-          <w:sz w:val="20"/>
-        </w:rPr>
-        <w:t>for real-time data processing.</w:t>
+          <w:sz w:val="20"/>
+        </w:rPr>
+        <w:t>behavior, leveraging Kafka, Spark, and AWS Kinesis for real-time data processing.</w:t>
       </w:r>
     </w:p>
     <w:p>
@@ -4515,14 +4079,12 @@
       </w:r>
       <w:r>
         <w:rPr>
-          <w:b/>
           <w:sz w:val="20"/>
         </w:rPr>
         <w:t>ML</w:t>
       </w:r>
       <w:r>
         <w:rPr>
-          <w:b/>
           <w:spacing w:val="-1"/>
           <w:sz w:val="20"/>
         </w:rPr>
@@ -4530,16 +4092,9 @@
       </w:r>
       <w:r>
         <w:rPr>
-          <w:b/>
-          <w:sz w:val="20"/>
-        </w:rPr>
-        <w:t xml:space="preserve">models </w:t>
-      </w:r>
-      <w:r>
-        <w:rPr>
-          <w:sz w:val="20"/>
-        </w:rPr>
-        <w:t>for</w:t>
+          <w:sz w:val="20"/>
+        </w:rPr>
+        <w:t>models for</w:t>
       </w:r>
       <w:r>
         <w:rPr>
@@ -4628,14 +4183,12 @@
       </w:r>
       <w:r>
         <w:rPr>
-          <w:b/>
           <w:sz w:val="20"/>
         </w:rPr>
         <w:t>Grafana/Prometheus</w:t>
       </w:r>
       <w:r>
         <w:rPr>
-          <w:b/>
           <w:spacing w:val="3"/>
           <w:sz w:val="20"/>
         </w:rPr>
@@ -4643,14 +4196,12 @@
       </w:r>
       <w:r>
         <w:rPr>
-          <w:b/>
           <w:sz w:val="20"/>
         </w:rPr>
         <w:t>dashboards</w:t>
       </w:r>
       <w:r>
         <w:rPr>
-          <w:b/>
           <w:spacing w:val="1"/>
           <w:sz w:val="20"/>
         </w:rPr>
@@ -4687,14 +4238,12 @@
       </w:pPr>
       <w:r>
         <w:rPr>
-          <w:b/>
           <w:sz w:val="20"/>
         </w:rPr>
         <w:t>actionable</w:t>
       </w:r>
       <w:r>
         <w:rPr>
-          <w:b/>
           <w:spacing w:val="-7"/>
           <w:sz w:val="20"/>
         </w:rPr>
@@ -4702,14 +4251,12 @@
       </w:r>
       <w:r>
         <w:rPr>
-          <w:b/>
           <w:sz w:val="20"/>
         </w:rPr>
         <w:t>reliability</w:t>
       </w:r>
       <w:r>
         <w:rPr>
-          <w:b/>
           <w:spacing w:val="-6"/>
           <w:sz w:val="20"/>
         </w:rPr>
@@ -4717,18 +4264,10 @@
       </w:r>
       <w:r>
         <w:rPr>
-          <w:b/>
-          <w:spacing w:val="-2"/>
-          <w:sz w:val="20"/>
-        </w:rPr>
-        <w:t>insights</w:t>
-      </w:r>
-      <w:r>
-        <w:rPr>
-          <w:spacing w:val="-2"/>
-          <w:sz w:val="20"/>
-        </w:rPr>
-        <w:t>.</w:t>
+          <w:spacing w:val="-2"/>
+          <w:sz w:val="20"/>
+        </w:rPr>
+        <w:t>insights.</w:t>
       </w:r>
     </w:p>
     <w:p>
@@ -4746,6 +4285,7 @@
       <w:r>
         <w:rPr>
           <w:b/>
+          <w:bCs/>
           <w:sz w:val="20"/>
         </w:rPr>
         <w:t>Syracuse Student Marketplace</w:t>
@@ -4788,46 +4328,7 @@
         <w:rPr>
           <w:sz w:val="20"/>
         </w:rPr>
-        <w:t xml:space="preserve">Building a </w:t>
-      </w:r>
-      <w:r>
-        <w:rPr>
-          <w:b/>
-          <w:sz w:val="20"/>
-        </w:rPr>
-        <w:t>peer-to-peer campus marketplace</w:t>
-      </w:r>
-      <w:r>
-        <w:rPr>
-          <w:sz w:val="20"/>
-        </w:rPr>
-        <w:t xml:space="preserve"> for Syracuse University students to buy, sell, and exchange items using </w:t>
-      </w:r>
-      <w:r>
-        <w:rPr>
-          <w:b/>
-          <w:sz w:val="20"/>
-        </w:rPr>
-        <w:t>Next.js, Supabase,</w:t>
-      </w:r>
-      <w:r>
-        <w:rPr>
-          <w:sz w:val="20"/>
-        </w:rPr>
-        <w:t xml:space="preserve"> and </w:t>
-      </w:r>
-      <w:r>
-        <w:rPr>
-          <w:b/>
-          <w:sz w:val="20"/>
-        </w:rPr>
-        <w:t>Vercel</w:t>
-      </w:r>
-      <w:r>
-        <w:rPr>
-          <w:sz w:val="20"/>
-        </w:rPr>
-        <w:t xml:space="preserve"> with real-time listings and university email authentication.</w:t>
+        <w:t>Building a peer-to-peer campus marketplace for Syracuse University students to buy, sell, and exchange items using Next.js, Supabase, and Vercel with real-time listings and university email authentication.</w:t>
       </w:r>
     </w:p>
     <w:p>
@@ -4851,33 +4352,7 @@
         <w:rPr>
           <w:sz w:val="20"/>
         </w:rPr>
-        <w:t xml:space="preserve">Designed </w:t>
-      </w:r>
-      <w:r>
-        <w:rPr>
-          <w:b/>
-          <w:sz w:val="20"/>
-        </w:rPr>
-        <w:t>row-level security policies</w:t>
-      </w:r>
-      <w:r>
-        <w:rPr>
-          <w:sz w:val="20"/>
-        </w:rPr>
-        <w:t xml:space="preserve"> in </w:t>
-      </w:r>
-      <w:r>
-        <w:rPr>
-          <w:b/>
-          <w:sz w:val="20"/>
-        </w:rPr>
-        <w:t>PostgreSQL via Supabase RLS</w:t>
-      </w:r>
-      <w:r>
-        <w:rPr>
-          <w:sz w:val="20"/>
-        </w:rPr>
-        <w:t xml:space="preserve"> to scope listing visibility and messaging to verified university users.</w:t>
+        <w:t>Designed row-level security policies in PostgreSQL via Supabase RLS to scope listing visibility and messaging to verified university users.</w:t>
       </w:r>
     </w:p>
     <w:sectPr>

</xml_diff>